<commit_message>
Apache Junction resume: Charter One title now Multimedia Specialist
Co-Authored-By: Claude Opus 5.5 <noreply@anthropic.com>
Claude-Session: https://claude.ai/code/session_01VpCXqDFSAKkK8y6mKL2HCw
</commit_message>
<xml_diff>
--- a/Job Hunt 2026/2026-10-23 - City of Apache Junction - Multimedia Specialist/Joshua_Chappell_Resume_CityOfApacheJunction.docx
+++ b/Job Hunt 2026/2026-10-23 - City of Apache Junction - Multimedia Specialist/Joshua_Chappell_Resume_CityOfApacheJunction.docx
@@ -33,7 +33,7 @@
         </w:rPr>
         <w:t xml:space="preserve">Mesa, AZ • 480-586-7959 • </w:t>
       </w:r>
-      <w:hyperlink w:history="1" r:id="rIdyjk2c3ar8gjdimh_hatjv">
+      <w:hyperlink w:history="1" r:id="rIdxvayrm0zxmqwwvsejtzol">
         <w:r>
           <w:rPr>
             <w:rFonts w:ascii="Calibri" w:cs="Calibri" w:eastAsia="Calibri" w:hAnsi="Calibri"/>
@@ -49,7 +49,7 @@
       <w:pPr>
         <w:jc w:val="center"/>
       </w:pPr>
-      <w:hyperlink w:history="1" r:id="rIdphxv_e9esh3dx4ycvpp2_">
+      <w:hyperlink w:history="1" r:id="rIdkrz6ychdzzhfpadwk59_f">
         <w:r>
           <w:rPr>
             <w:rFonts w:ascii="Calibri" w:cs="Calibri" w:eastAsia="Calibri" w:hAnsi="Calibri"/>
@@ -69,7 +69,7 @@
         </w:rPr>
         <w:t xml:space="preserve"> • </w:t>
       </w:r>
-      <w:hyperlink w:history="1" r:id="rIdx3jbygkexxzb3h-murw4g">
+      <w:hyperlink w:history="1" r:id="rId56lnwlgb33dle_bzulugf">
         <w:r>
           <w:rPr>
             <w:rFonts w:ascii="Calibri" w:cs="Calibri" w:eastAsia="Calibri" w:hAnsi="Calibri"/>
@@ -89,7 +89,7 @@
         </w:rPr>
         <w:t xml:space="preserve"> • </w:t>
       </w:r>
-      <w:hyperlink w:history="1" r:id="rIdkc9ah6vnki2hypjyqaeez">
+      <w:hyperlink w:history="1" r:id="rIdd3d2jo3t42nk9hca3q43t">
         <w:r>
           <w:rPr>
             <w:rFonts w:ascii="Calibri" w:cs="Calibri" w:eastAsia="Calibri" w:hAnsi="Calibri"/>
@@ -161,7 +161,7 @@
           <w:sz w:val="20"/>
           <w:szCs w:val="20"/>
         </w:rPr>
-        <w:t xml:space="preserve">, Media Specialist</w:t>
+        <w:t xml:space="preserve">, Multimedia Specialist</w:t>
       </w:r>
       <w:r>
         <w:rPr>

</xml_diff>

<commit_message>
Apache Junction resume: reference links are now intro video, portfolio, LinkedIn
Co-Authored-By: Claude Opus 5.5 <noreply@anthropic.com>
Claude-Session: https://claude.ai/code/session_01VpCXqDFSAKkK8y6mKL2HCw
</commit_message>
<xml_diff>
--- a/Job Hunt 2026/2026-10-23 - City of Apache Junction - Multimedia Specialist/Joshua_Chappell_Resume_CityOfApacheJunction.docx
+++ b/Job Hunt 2026/2026-10-23 - City of Apache Junction - Multimedia Specialist/Joshua_Chappell_Resume_CityOfApacheJunction.docx
@@ -33,7 +33,7 @@
         </w:rPr>
         <w:t xml:space="preserve">Mesa, AZ • 480-586-7959 • </w:t>
       </w:r>
-      <w:hyperlink w:history="1" r:id="rIdxvayrm0zxmqwwvsejtzol">
+      <w:hyperlink w:history="1" r:id="rIdozvybxyays0ghds7fiisp">
         <w:r>
           <w:rPr>
             <w:rFonts w:ascii="Calibri" w:cs="Calibri" w:eastAsia="Calibri" w:hAnsi="Calibri"/>
@@ -49,7 +49,7 @@
       <w:pPr>
         <w:jc w:val="center"/>
       </w:pPr>
-      <w:hyperlink w:history="1" r:id="rIdkrz6ychdzzhfpadwk59_f">
+      <w:hyperlink w:history="1" r:id="rIdmvbjiiz5awpqlkjz4r4bf">
         <w:r>
           <w:rPr>
             <w:rFonts w:ascii="Calibri" w:cs="Calibri" w:eastAsia="Calibri" w:hAnsi="Calibri"/>
@@ -57,7 +57,7 @@
             <w:sz w:val="20"/>
             <w:szCs w:val="20"/>
           </w:rPr>
-          <w:t xml:space="preserve">Demo Reel</w:t>
+          <w:t xml:space="preserve">Intro Video: vimeo.com/1109495649</w:t>
         </w:r>
       </w:hyperlink>
       <w:r>
@@ -69,7 +69,7 @@
         </w:rPr>
         <w:t xml:space="preserve"> • </w:t>
       </w:r>
-      <w:hyperlink w:history="1" r:id="rId56lnwlgb33dle_bzulugf">
+      <w:hyperlink w:history="1" r:id="rIdrdqhruovgqnkindijye7z">
         <w:r>
           <w:rPr>
             <w:rFonts w:ascii="Calibri" w:cs="Calibri" w:eastAsia="Calibri" w:hAnsi="Calibri"/>
@@ -77,7 +77,7 @@
             <w:sz w:val="20"/>
             <w:szCs w:val="20"/>
           </w:rPr>
-          <w:t xml:space="preserve">Legislature Video</w:t>
+          <w:t xml:space="preserve">Portfolio: lightbox-digital.com</w:t>
         </w:r>
       </w:hyperlink>
       <w:r>
@@ -89,7 +89,7 @@
         </w:rPr>
         <w:t xml:space="preserve"> • </w:t>
       </w:r>
-      <w:hyperlink w:history="1" r:id="rIdd3d2jo3t42nk9hca3q43t">
+      <w:hyperlink w:history="1" r:id="rIdfey9xceiorhwbc-aw3ofe">
         <w:r>
           <w:rPr>
             <w:rFonts w:ascii="Calibri" w:cs="Calibri" w:eastAsia="Calibri" w:hAnsi="Calibri"/>
@@ -97,7 +97,7 @@
             <w:sz w:val="20"/>
             <w:szCs w:val="20"/>
           </w:rPr>
-          <w:t xml:space="preserve">LinkedIn</w:t>
+          <w:t xml:space="preserve">LinkedIn: linkedin.com/in/joshua-chappell</w:t>
         </w:r>
       </w:hyperlink>
     </w:p>

</xml_diff>

<commit_message>
Apache Junction resume: header links as words only (Intro Video, Portfolio, LinkedIn), each hyperlinked
Co-Authored-By: Claude Opus 5.5 <noreply@anthropic.com>
Claude-Session: https://claude.ai/code/session_01VpCXqDFSAKkK8y6mKL2HCw
</commit_message>
<xml_diff>
--- a/Job Hunt 2026/2026-10-23 - City of Apache Junction - Multimedia Specialist/Joshua_Chappell_Resume_CityOfApacheJunction.docx
+++ b/Job Hunt 2026/2026-10-23 - City of Apache Junction - Multimedia Specialist/Joshua_Chappell_Resume_CityOfApacheJunction.docx
@@ -33,7 +33,7 @@
         </w:rPr>
         <w:t xml:space="preserve">Mesa, AZ • 480-586-7959 • </w:t>
       </w:r>
-      <w:hyperlink w:history="1" r:id="rId_efjgrznuwp3brthlhs_t">
+      <w:hyperlink w:history="1" r:id="rId99ix4b6kvyqojhpnqv7to">
         <w:r>
           <w:rPr>
             <w:rFonts w:ascii="Calibri" w:cs="Calibri" w:eastAsia="Calibri" w:hAnsi="Calibri"/>
@@ -49,7 +49,7 @@
       <w:pPr>
         <w:jc w:val="center"/>
       </w:pPr>
-      <w:hyperlink w:history="1" r:id="rId_znlfofpxmoega4fubmbm">
+      <w:hyperlink w:history="1" r:id="rIdymjl6rclmuw2nxsmf9qmb">
         <w:r>
           <w:rPr>
             <w:rFonts w:ascii="Calibri" w:cs="Calibri" w:eastAsia="Calibri" w:hAnsi="Calibri"/>
@@ -57,7 +57,7 @@
             <w:sz w:val="20"/>
             <w:szCs w:val="20"/>
           </w:rPr>
-          <w:t xml:space="preserve">Intro Video: vimeo.com/1109495649</w:t>
+          <w:t xml:space="preserve">Intro Video</w:t>
         </w:r>
       </w:hyperlink>
       <w:r>
@@ -69,7 +69,7 @@
         </w:rPr>
         <w:t xml:space="preserve"> • </w:t>
       </w:r>
-      <w:hyperlink w:history="1" r:id="rIdj3x1pwi4xhfphc1psl2ov">
+      <w:hyperlink w:history="1" r:id="rIdf36gavuwj6rq39zer-ooj">
         <w:r>
           <w:rPr>
             <w:rFonts w:ascii="Calibri" w:cs="Calibri" w:eastAsia="Calibri" w:hAnsi="Calibri"/>
@@ -77,7 +77,7 @@
             <w:sz w:val="20"/>
             <w:szCs w:val="20"/>
           </w:rPr>
-          <w:t xml:space="preserve">Portfolio: lightbox-digital.com</w:t>
+          <w:t xml:space="preserve">Portfolio</w:t>
         </w:r>
       </w:hyperlink>
       <w:r>
@@ -89,7 +89,7 @@
         </w:rPr>
         <w:t xml:space="preserve"> • </w:t>
       </w:r>
-      <w:hyperlink w:history="1" r:id="rIdkw4bpml93diynyibnc_nh">
+      <w:hyperlink w:history="1" r:id="rIdol0dymmpehocw-i4vzrrl">
         <w:r>
           <w:rPr>
             <w:rFonts w:ascii="Calibri" w:cs="Calibri" w:eastAsia="Calibri" w:hAnsi="Calibri"/>
@@ -97,7 +97,7 @@
             <w:sz w:val="20"/>
             <w:szCs w:val="20"/>
           </w:rPr>
-          <w:t xml:space="preserve">LinkedIn: linkedin.com/in/joshua-chappell</w:t>
+          <w:t xml:space="preserve">LinkedIn</w:t>
         </w:r>
       </w:hyperlink>
     </w:p>

</xml_diff>

<commit_message>
Charter One Adobe bullet: created videos and end title graphics
Co-Authored-By: Claude Opus 5.5 <noreply@anthropic.com>
Claude-Session: https://claude.ai/code/session_01VpCXqDFSAKkK8y6mKL2HCw
</commit_message>
<xml_diff>
--- a/Job Hunt 2026/2026-10-23 - City of Apache Junction - Multimedia Specialist/Joshua_Chappell_Resume_CityOfApacheJunction.docx
+++ b/Job Hunt 2026/2026-10-23 - City of Apache Junction - Multimedia Specialist/Joshua_Chappell_Resume_CityOfApacheJunction.docx
@@ -33,7 +33,7 @@
         </w:rPr>
         <w:t xml:space="preserve">Mesa, AZ • 480-586-7959 • </w:t>
       </w:r>
-      <w:hyperlink w:history="1" r:id="rId99ix4b6kvyqojhpnqv7to">
+      <w:hyperlink w:history="1" r:id="rIdo98xbssox57qr747bccal">
         <w:r>
           <w:rPr>
             <w:rFonts w:ascii="Calibri" w:cs="Calibri" w:eastAsia="Calibri" w:hAnsi="Calibri"/>
@@ -49,7 +49,7 @@
       <w:pPr>
         <w:jc w:val="center"/>
       </w:pPr>
-      <w:hyperlink w:history="1" r:id="rIdymjl6rclmuw2nxsmf9qmb">
+      <w:hyperlink w:history="1" r:id="rIdgye0ur7jdbp_adxudnjpn">
         <w:r>
           <w:rPr>
             <w:rFonts w:ascii="Calibri" w:cs="Calibri" w:eastAsia="Calibri" w:hAnsi="Calibri"/>
@@ -69,7 +69,7 @@
         </w:rPr>
         <w:t xml:space="preserve"> • </w:t>
       </w:r>
-      <w:hyperlink w:history="1" r:id="rIdf36gavuwj6rq39zer-ooj">
+      <w:hyperlink w:history="1" r:id="rIdkcmcy0gsa_wfxgsb3erws">
         <w:r>
           <w:rPr>
             <w:rFonts w:ascii="Calibri" w:cs="Calibri" w:eastAsia="Calibri" w:hAnsi="Calibri"/>
@@ -89,7 +89,7 @@
         </w:rPr>
         <w:t xml:space="preserve"> • </w:t>
       </w:r>
-      <w:hyperlink w:history="1" r:id="rIdol0dymmpehocw-i4vzrrl">
+      <w:hyperlink w:history="1" r:id="rIdvoitndynmgood5q0blo2f">
         <w:r>
           <w:rPr>
             <w:rFonts w:ascii="Calibri" w:cs="Calibri" w:eastAsia="Calibri" w:hAnsi="Calibri"/>
@@ -216,7 +216,7 @@
           <w:sz w:val="20"/>
           <w:szCs w:val="20"/>
         </w:rPr>
-        <w:t xml:space="preserve">Utilized the Adobe Creative Suite, including Premiere Pro, After Effects, Photoshop, and Illustrator, to create end title graphics for videos.</w:t>
+        <w:t xml:space="preserve">Utilized the Adobe Creative Suite, including Premiere Pro, After Effects, Photoshop, and Illustrator, to create videos and end title graphics.</w:t>
       </w:r>
     </w:p>
     <w:p>

</xml_diff>